<commit_message>
lab 3 and 4
</commit_message>
<xml_diff>
--- a/labs/3 - OLTP/BD3 звіт.docx
+++ b/labs/3 - OLTP/BD3 звіт.docx
@@ -15445,12 +15445,12 @@
           <wp:inline distB="114300" distT="114300" distL="114300" distR="114300">
             <wp:extent cx="5929025" cy="1034132"/>
             <wp:effectExtent b="0" l="0" r="0" t="0"/>
-            <wp:docPr id="5" name="image16.png"/>
+            <wp:docPr id="20" name="image18.png"/>
             <a:graphic>
               <a:graphicData uri="http://schemas.openxmlformats.org/drawingml/2006/picture">
                 <pic:pic>
                   <pic:nvPicPr>
-                    <pic:cNvPr id="0" name="image16.png"/>
+                    <pic:cNvPr id="0" name="image18.png"/>
                     <pic:cNvPicPr preferRelativeResize="0"/>
                   </pic:nvPicPr>
                   <pic:blipFill>
@@ -15506,12 +15506,12 @@
           <wp:inline distB="114300" distT="114300" distL="114300" distR="114300">
             <wp:extent cx="5781675" cy="1247465"/>
             <wp:effectExtent b="0" l="0" r="0" t="0"/>
-            <wp:docPr id="3" name="image10.png"/>
+            <wp:docPr id="17" name="image8.png"/>
             <a:graphic>
               <a:graphicData uri="http://schemas.openxmlformats.org/drawingml/2006/picture">
                 <pic:pic>
                   <pic:nvPicPr>
-                    <pic:cNvPr id="0" name="image10.png"/>
+                    <pic:cNvPr id="0" name="image8.png"/>
                     <pic:cNvPicPr preferRelativeResize="0"/>
                   </pic:nvPicPr>
                   <pic:blipFill>
@@ -15567,12 +15567,12 @@
           <wp:inline distB="114300" distT="114300" distL="114300" distR="114300">
             <wp:extent cx="3290888" cy="1098785"/>
             <wp:effectExtent b="0" l="0" r="0" t="0"/>
-            <wp:docPr id="19" name="image12.png"/>
+            <wp:docPr id="28" name="image26.png"/>
             <a:graphic>
               <a:graphicData uri="http://schemas.openxmlformats.org/drawingml/2006/picture">
                 <pic:pic>
                   <pic:nvPicPr>
-                    <pic:cNvPr id="0" name="image12.png"/>
+                    <pic:cNvPr id="0" name="image26.png"/>
                     <pic:cNvPicPr preferRelativeResize="0"/>
                   </pic:nvPicPr>
                   <pic:blipFill>
@@ -15621,7 +15621,7 @@
           <w:szCs w:val="28"/>
           <w:rtl w:val="0"/>
         </w:rPr>
-        <w:t xml:space="preserve">Результат запиту: Користувача можна успішно видалити. В таблиці order ключ користувача зміниться на null, при цьому дані про саму покупку збережуться, рядки в асоціативний таблицях видаляться завдяки on delete cascade.</w:t>
+        <w:t xml:space="preserve">Результат запиту: Користувача можна успішно видалити. В таблиці ключ користувача залишиться, адже тепер user_id не референсить користувача.</w:t>
       </w:r>
     </w:p>
     <w:p>
@@ -15648,14 +15648,14 @@
         </w:rPr>
         <w:drawing>
           <wp:inline distB="114300" distT="114300" distL="114300" distR="114300">
-            <wp:extent cx="5731200" cy="2120900"/>
+            <wp:extent cx="5745600" cy="1879600"/>
             <wp:effectExtent b="0" l="0" r="0" t="0"/>
-            <wp:docPr id="9" name="image19.png"/>
+            <wp:docPr id="22" name="image22.png"/>
             <a:graphic>
               <a:graphicData uri="http://schemas.openxmlformats.org/drawingml/2006/picture">
                 <pic:pic>
                   <pic:nvPicPr>
-                    <pic:cNvPr id="0" name="image19.png"/>
+                    <pic:cNvPr id="0" name="image22.png"/>
                     <pic:cNvPicPr preferRelativeResize="0"/>
                   </pic:nvPicPr>
                   <pic:blipFill>
@@ -15668,7 +15668,7 @@
                   <pic:spPr>
                     <a:xfrm>
                       <a:off x="0" y="0"/>
-                      <a:ext cx="5731200" cy="2120900"/>
+                      <a:ext cx="5745600" cy="1879600"/>
                     </a:xfrm>
                     <a:prstGeom prst="rect"/>
                     <a:ln/>
@@ -15711,12 +15711,12 @@
           <wp:inline distB="114300" distT="114300" distL="114300" distR="114300">
             <wp:extent cx="4052888" cy="2228415"/>
             <wp:effectExtent b="0" l="0" r="0" t="0"/>
-            <wp:docPr id="13" name="image17.png"/>
+            <wp:docPr id="26" name="image28.png"/>
             <a:graphic>
               <a:graphicData uri="http://schemas.openxmlformats.org/drawingml/2006/picture">
                 <pic:pic>
                   <pic:nvPicPr>
-                    <pic:cNvPr id="0" name="image17.png"/>
+                    <pic:cNvPr id="0" name="image28.png"/>
                     <pic:cNvPicPr preferRelativeResize="0"/>
                   </pic:nvPicPr>
                   <pic:blipFill>
@@ -15847,12 +15847,12 @@
           <wp:inline distB="114300" distT="114300" distL="114300" distR="114300">
             <wp:extent cx="5731200" cy="1358900"/>
             <wp:effectExtent b="0" l="0" r="0" t="0"/>
-            <wp:docPr id="8" name="image15.png"/>
+            <wp:docPr id="5" name="image13.png"/>
             <a:graphic>
               <a:graphicData uri="http://schemas.openxmlformats.org/drawingml/2006/picture">
                 <pic:pic>
                   <pic:nvPicPr>
-                    <pic:cNvPr id="0" name="image15.png"/>
+                    <pic:cNvPr id="0" name="image13.png"/>
                     <pic:cNvPicPr preferRelativeResize="0"/>
                   </pic:nvPicPr>
                   <pic:blipFill>
@@ -15957,12 +15957,12 @@
           <wp:inline distB="114300" distT="114300" distL="114300" distR="114300">
             <wp:extent cx="5731200" cy="1765300"/>
             <wp:effectExtent b="0" l="0" r="0" t="0"/>
-            <wp:docPr id="17" name="image8.png"/>
+            <wp:docPr id="13" name="image17.png"/>
             <a:graphic>
               <a:graphicData uri="http://schemas.openxmlformats.org/drawingml/2006/picture">
                 <pic:pic>
                   <pic:nvPicPr>
-                    <pic:cNvPr id="0" name="image8.png"/>
+                    <pic:cNvPr id="0" name="image17.png"/>
                     <pic:cNvPicPr preferRelativeResize="0"/>
                   </pic:nvPicPr>
                   <pic:blipFill>
@@ -16040,12 +16040,12 @@
           <wp:inline distB="114300" distT="114300" distL="114300" distR="114300">
             <wp:extent cx="5731200" cy="2768600"/>
             <wp:effectExtent b="0" l="0" r="0" t="0"/>
-            <wp:docPr id="16" name="image13.png"/>
+            <wp:docPr id="27" name="image27.png"/>
             <a:graphic>
               <a:graphicData uri="http://schemas.openxmlformats.org/drawingml/2006/picture">
                 <pic:pic>
                   <pic:nvPicPr>
-                    <pic:cNvPr id="0" name="image13.png"/>
+                    <pic:cNvPr id="0" name="image27.png"/>
                     <pic:cNvPicPr preferRelativeResize="0"/>
                   </pic:nvPicPr>
                   <pic:blipFill>
@@ -16138,12 +16138,12 @@
           <wp:inline distB="114300" distT="114300" distL="114300" distR="114300">
             <wp:extent cx="5731200" cy="1079500"/>
             <wp:effectExtent b="0" l="0" r="0" t="0"/>
-            <wp:docPr id="2" name="image9.png"/>
+            <wp:docPr id="16" name="image20.png"/>
             <a:graphic>
               <a:graphicData uri="http://schemas.openxmlformats.org/drawingml/2006/picture">
                 <pic:pic>
                   <pic:nvPicPr>
-                    <pic:cNvPr id="0" name="image9.png"/>
+                    <pic:cNvPr id="0" name="image20.png"/>
                     <pic:cNvPicPr preferRelativeResize="0"/>
                   </pic:nvPicPr>
                   <pic:blipFill>
@@ -16285,12 +16285,12 @@
           <wp:inline distB="114300" distT="114300" distL="114300" distR="114300">
             <wp:extent cx="5731200" cy="1955800"/>
             <wp:effectExtent b="0" l="0" r="0" t="0"/>
-            <wp:docPr id="12" name="image7.png"/>
+            <wp:docPr id="8" name="image9.png"/>
             <a:graphic>
               <a:graphicData uri="http://schemas.openxmlformats.org/drawingml/2006/picture">
                 <pic:pic>
                   <pic:nvPicPr>
-                    <pic:cNvPr id="0" name="image7.png"/>
+                    <pic:cNvPr id="0" name="image9.png"/>
                     <pic:cNvPicPr preferRelativeResize="0"/>
                   </pic:nvPicPr>
                   <pic:blipFill>
@@ -16366,12 +16366,12 @@
           <wp:inline distB="114300" distT="114300" distL="114300" distR="114300">
             <wp:extent cx="2938463" cy="2221278"/>
             <wp:effectExtent b="0" l="0" r="0" t="0"/>
-            <wp:docPr id="1" name="image1.png"/>
+            <wp:docPr id="1" name="image11.png"/>
             <a:graphic>
               <a:graphicData uri="http://schemas.openxmlformats.org/drawingml/2006/picture">
                 <pic:pic>
                   <pic:nvPicPr>
-                    <pic:cNvPr id="0" name="image1.png"/>
+                    <pic:cNvPr id="0" name="image11.png"/>
                     <pic:cNvPicPr preferRelativeResize="0"/>
                   </pic:nvPicPr>
                   <pic:blipFill>
@@ -16473,12 +16473,12 @@
           <wp:inline distB="114300" distT="114300" distL="114300" distR="114300">
             <wp:extent cx="4329113" cy="1632406"/>
             <wp:effectExtent b="0" l="0" r="0" t="0"/>
-            <wp:docPr id="11" name="image6.png"/>
+            <wp:docPr id="24" name="image19.png"/>
             <a:graphic>
               <a:graphicData uri="http://schemas.openxmlformats.org/drawingml/2006/picture">
                 <pic:pic>
                   <pic:nvPicPr>
-                    <pic:cNvPr id="0" name="image6.png"/>
+                    <pic:cNvPr id="0" name="image19.png"/>
                     <pic:cNvPicPr preferRelativeResize="0"/>
                   </pic:nvPicPr>
                   <pic:blipFill>
@@ -16552,12 +16552,12 @@
           <wp:inline distB="114300" distT="114300" distL="114300" distR="114300">
             <wp:extent cx="5731200" cy="1943100"/>
             <wp:effectExtent b="0" l="0" r="0" t="0"/>
-            <wp:docPr id="14" name="image20.png"/>
+            <wp:docPr id="10" name="image5.png"/>
             <a:graphic>
               <a:graphicData uri="http://schemas.openxmlformats.org/drawingml/2006/picture">
                 <pic:pic>
                   <pic:nvPicPr>
-                    <pic:cNvPr id="0" name="image20.png"/>
+                    <pic:cNvPr id="0" name="image5.png"/>
                     <pic:cNvPicPr preferRelativeResize="0"/>
                   </pic:nvPicPr>
                   <pic:blipFill>
@@ -16611,7 +16611,7 @@
           <wp:inline distB="114300" distT="114300" distL="114300" distR="114300">
             <wp:extent cx="3995738" cy="1950403"/>
             <wp:effectExtent b="0" l="0" r="0" t="0"/>
-            <wp:docPr id="10" name="image14.png"/>
+            <wp:docPr id="7" name="image14.png"/>
             <a:graphic>
               <a:graphicData uri="http://schemas.openxmlformats.org/drawingml/2006/picture">
                 <pic:pic>
@@ -16670,12 +16670,12 @@
           <wp:inline distB="114300" distT="114300" distL="114300" distR="114300">
             <wp:extent cx="5731200" cy="1612900"/>
             <wp:effectExtent b="0" l="0" r="0" t="0"/>
-            <wp:docPr id="4" name="image3.png"/>
+            <wp:docPr id="19" name="image25.png"/>
             <a:graphic>
               <a:graphicData uri="http://schemas.openxmlformats.org/drawingml/2006/picture">
                 <pic:pic>
                   <pic:nvPicPr>
-                    <pic:cNvPr id="0" name="image3.png"/>
+                    <pic:cNvPr id="0" name="image25.png"/>
                     <pic:cNvPicPr preferRelativeResize="0"/>
                   </pic:nvPicPr>
                   <pic:blipFill>
@@ -16729,12 +16729,12 @@
           <wp:inline distB="114300" distT="114300" distL="114300" distR="114300">
             <wp:extent cx="3367088" cy="1548686"/>
             <wp:effectExtent b="0" l="0" r="0" t="0"/>
-            <wp:docPr id="18" name="image18.png"/>
+            <wp:docPr id="14" name="image10.png"/>
             <a:graphic>
               <a:graphicData uri="http://schemas.openxmlformats.org/drawingml/2006/picture">
                 <pic:pic>
                   <pic:nvPicPr>
-                    <pic:cNvPr id="0" name="image18.png"/>
+                    <pic:cNvPr id="0" name="image10.png"/>
                     <pic:cNvPicPr preferRelativeResize="0"/>
                   </pic:nvPicPr>
                   <pic:blipFill>
@@ -16871,12 +16871,12 @@
           <wp:inline distB="114300" distT="114300" distL="114300" distR="114300">
             <wp:extent cx="4814888" cy="2463431"/>
             <wp:effectExtent b="0" l="0" r="0" t="0"/>
-            <wp:docPr id="20" name="image4.png"/>
+            <wp:docPr id="15" name="image21.png"/>
             <a:graphic>
               <a:graphicData uri="http://schemas.openxmlformats.org/drawingml/2006/picture">
                 <pic:pic>
                   <pic:nvPicPr>
-                    <pic:cNvPr id="0" name="image4.png"/>
+                    <pic:cNvPr id="0" name="image21.png"/>
                     <pic:cNvPicPr preferRelativeResize="0"/>
                   </pic:nvPicPr>
                   <pic:blipFill>
@@ -16951,12 +16951,12 @@
           <wp:inline distB="114300" distT="114300" distL="114300" distR="114300">
             <wp:extent cx="5731200" cy="1409700"/>
             <wp:effectExtent b="0" l="0" r="0" t="0"/>
-            <wp:docPr id="7" name="image11.png"/>
+            <wp:docPr id="4" name="image1.png"/>
             <a:graphic>
               <a:graphicData uri="http://schemas.openxmlformats.org/drawingml/2006/picture">
                 <pic:pic>
                   <pic:nvPicPr>
-                    <pic:cNvPr id="0" name="image11.png"/>
+                    <pic:cNvPr id="0" name="image1.png"/>
                     <pic:cNvPicPr preferRelativeResize="0"/>
                   </pic:nvPicPr>
                   <pic:blipFill>
@@ -17010,12 +17010,12 @@
           <wp:inline distB="114300" distT="114300" distL="114300" distR="114300">
             <wp:extent cx="4077600" cy="1896822"/>
             <wp:effectExtent b="0" l="0" r="0" t="0"/>
-            <wp:docPr id="6" name="image5.png"/>
+            <wp:docPr id="21" name="image15.png"/>
             <a:graphic>
               <a:graphicData uri="http://schemas.openxmlformats.org/drawingml/2006/picture">
                 <pic:pic>
                   <pic:nvPicPr>
-                    <pic:cNvPr id="0" name="image5.png"/>
+                    <pic:cNvPr id="0" name="image15.png"/>
                     <pic:cNvPicPr preferRelativeResize="0"/>
                   </pic:nvPicPr>
                   <pic:blipFill>
@@ -17070,12 +17070,12 @@
           <wp:inline distB="114300" distT="114300" distL="114300" distR="114300">
             <wp:extent cx="5745600" cy="1485900"/>
             <wp:effectExtent b="0" l="0" r="0" t="0"/>
-            <wp:docPr id="15" name="image2.png"/>
+            <wp:docPr id="11" name="image7.png"/>
             <a:graphic>
               <a:graphicData uri="http://schemas.openxmlformats.org/drawingml/2006/picture">
                 <pic:pic>
                   <pic:nvPicPr>
-                    <pic:cNvPr id="0" name="image2.png"/>
+                    <pic:cNvPr id="0" name="image7.png"/>
                     <pic:cNvPicPr preferRelativeResize="0"/>
                   </pic:nvPicPr>
                   <pic:blipFill>
@@ -17123,6 +17123,766 @@
           <w:rtl w:val="0"/>
         </w:rPr>
         <w:t xml:space="preserve">Як і очікувалося спочатку користувач не може залишити відгук, але коли награний час становить 2 години, то проблем немає. </w:t>
+      </w:r>
+    </w:p>
+    <w:p>
+      <w:pPr>
+        <w:spacing w:after="280" w:before="280" w:line="240" w:lineRule="auto"/>
+        <w:ind w:left="0" w:firstLine="0"/>
+        <w:rPr>
+          <w:rFonts w:ascii="Times New Roman" w:cs="Times New Roman" w:eastAsia="Times New Roman" w:hAnsi="Times New Roman"/>
+          <w:b w:val="1"/>
+          <w:bCs w:val="1"/>
+          <w:sz w:val="28"/>
+          <w:szCs w:val="28"/>
+        </w:rPr>
+      </w:pPr>
+      <w:r>
+        <w:rPr>
+          <w:rFonts w:ascii="Times New Roman" w:cs="Times New Roman" w:eastAsia="Times New Roman" w:hAnsi="Times New Roman"/>
+          <w:sz w:val="28"/>
+          <w:szCs w:val="28"/>
+          <w:rtl w:val="0"/>
+        </w:rPr>
+        <w:t xml:space="preserve">7.   </w:t>
+      </w:r>
+      <w:r>
+        <w:rPr>
+          <w:rFonts w:ascii="Times New Roman" w:cs="Times New Roman" w:eastAsia="Times New Roman" w:hAnsi="Times New Roman"/>
+          <w:b w:val="1"/>
+          <w:bCs w:val="1"/>
+          <w:sz w:val="28"/>
+          <w:szCs w:val="28"/>
+          <w:rtl w:val="0"/>
+        </w:rPr>
+        <w:t xml:space="preserve">Мета: Вивести продукти, на які не було залишено жодного відгуку</w:t>
+      </w:r>
+    </w:p>
+    <w:p>
+      <w:pPr>
+        <w:spacing w:after="280" w:before="280" w:line="240" w:lineRule="auto"/>
+        <w:ind w:left="0" w:firstLine="0"/>
+        <w:rPr>
+          <w:rFonts w:ascii="Times New Roman" w:cs="Times New Roman" w:eastAsia="Times New Roman" w:hAnsi="Times New Roman"/>
+          <w:sz w:val="28"/>
+          <w:szCs w:val="28"/>
+        </w:rPr>
+      </w:pPr>
+      <w:r>
+        <w:rPr>
+          <w:rFonts w:ascii="Times New Roman" w:cs="Times New Roman" w:eastAsia="Times New Roman" w:hAnsi="Times New Roman"/>
+          <w:sz w:val="28"/>
+          <w:szCs w:val="28"/>
+          <w:rtl w:val="0"/>
+        </w:rPr>
+        <w:t xml:space="preserve">Очікуваний результат: Виводиться продукт з id 4, на який ще не було залишено жодного відгуку.</w:t>
+      </w:r>
+    </w:p>
+    <w:p>
+      <w:pPr>
+        <w:spacing w:after="280" w:before="280" w:line="240" w:lineRule="auto"/>
+        <w:ind w:left="0" w:firstLine="0"/>
+        <w:rPr>
+          <w:rFonts w:ascii="Times New Roman" w:cs="Times New Roman" w:eastAsia="Times New Roman" w:hAnsi="Times New Roman"/>
+          <w:sz w:val="28"/>
+          <w:szCs w:val="28"/>
+        </w:rPr>
+      </w:pPr>
+      <w:r>
+        <w:rPr>
+          <w:rFonts w:ascii="Times New Roman" w:cs="Times New Roman" w:eastAsia="Times New Roman" w:hAnsi="Times New Roman"/>
+          <w:sz w:val="28"/>
+          <w:szCs w:val="28"/>
+          <w:rtl w:val="0"/>
+        </w:rPr>
+        <w:t xml:space="preserve">Результат:</w:t>
+      </w:r>
+    </w:p>
+    <w:p>
+      <w:pPr>
+        <w:spacing w:after="280" w:before="280" w:line="240" w:lineRule="auto"/>
+        <w:ind w:left="0" w:firstLine="0"/>
+        <w:rPr>
+          <w:rFonts w:ascii="Times New Roman" w:cs="Times New Roman" w:eastAsia="Times New Roman" w:hAnsi="Times New Roman"/>
+          <w:sz w:val="28"/>
+          <w:szCs w:val="28"/>
+        </w:rPr>
+      </w:pPr>
+      <w:r>
+        <w:rPr>
+          <w:rFonts w:ascii="Times New Roman" w:cs="Times New Roman" w:eastAsia="Times New Roman" w:hAnsi="Times New Roman"/>
+          <w:sz w:val="28"/>
+          <w:szCs w:val="28"/>
+        </w:rPr>
+        <w:drawing>
+          <wp:inline distB="114300" distT="114300" distL="114300" distR="114300">
+            <wp:extent cx="5745600" cy="1308100"/>
+            <wp:effectExtent b="0" l="0" r="0" t="0"/>
+            <wp:docPr id="6" name="image2.png"/>
+            <a:graphic>
+              <a:graphicData uri="http://schemas.openxmlformats.org/drawingml/2006/picture">
+                <pic:pic>
+                  <pic:nvPicPr>
+                    <pic:cNvPr id="0" name="image2.png"/>
+                    <pic:cNvPicPr preferRelativeResize="0"/>
+                  </pic:nvPicPr>
+                  <pic:blipFill>
+                    <a:blip r:embed="rId26"/>
+                    <a:srcRect b="0" l="0" r="0" t="0"/>
+                    <a:stretch>
+                      <a:fillRect/>
+                    </a:stretch>
+                  </pic:blipFill>
+                  <pic:spPr>
+                    <a:xfrm>
+                      <a:off x="0" y="0"/>
+                      <a:ext cx="5745600" cy="1308100"/>
+                    </a:xfrm>
+                    <a:prstGeom prst="rect"/>
+                    <a:ln/>
+                  </pic:spPr>
+                </pic:pic>
+              </a:graphicData>
+            </a:graphic>
+          </wp:inline>
+        </w:drawing>
+      </w:r>
+      <w:r>
+        <w:rPr>
+          <w:rtl w:val="0"/>
+        </w:rPr>
+      </w:r>
+    </w:p>
+    <w:p>
+      <w:pPr>
+        <w:spacing w:after="280" w:before="280" w:line="240" w:lineRule="auto"/>
+        <w:ind w:left="0" w:firstLine="0"/>
+        <w:rPr>
+          <w:rFonts w:ascii="Times New Roman" w:cs="Times New Roman" w:eastAsia="Times New Roman" w:hAnsi="Times New Roman"/>
+          <w:b w:val="1"/>
+          <w:bCs w:val="1"/>
+          <w:sz w:val="28"/>
+          <w:szCs w:val="28"/>
+        </w:rPr>
+      </w:pPr>
+      <w:r>
+        <w:rPr>
+          <w:rFonts w:ascii="Times New Roman" w:cs="Times New Roman" w:eastAsia="Times New Roman" w:hAnsi="Times New Roman"/>
+          <w:sz w:val="28"/>
+          <w:szCs w:val="28"/>
+          <w:rtl w:val="0"/>
+        </w:rPr>
+        <w:t xml:space="preserve">8. </w:t>
+      </w:r>
+      <w:r>
+        <w:rPr>
+          <w:rFonts w:ascii="Times New Roman" w:cs="Times New Roman" w:eastAsia="Times New Roman" w:hAnsi="Times New Roman"/>
+          <w:b w:val="1"/>
+          <w:bCs w:val="1"/>
+          <w:sz w:val="28"/>
+          <w:szCs w:val="28"/>
+          <w:rtl w:val="0"/>
+        </w:rPr>
+        <w:t xml:space="preserve">Мета: Поповнити гаманець користувача</w:t>
+      </w:r>
+    </w:p>
+    <w:p>
+      <w:pPr>
+        <w:spacing w:after="280" w:before="280" w:line="240" w:lineRule="auto"/>
+        <w:ind w:left="0" w:firstLine="0"/>
+        <w:rPr>
+          <w:rFonts w:ascii="Times New Roman" w:cs="Times New Roman" w:eastAsia="Times New Roman" w:hAnsi="Times New Roman"/>
+          <w:b w:val="1"/>
+          <w:bCs w:val="1"/>
+          <w:sz w:val="28"/>
+          <w:szCs w:val="28"/>
+        </w:rPr>
+      </w:pPr>
+      <w:r>
+        <w:rPr>
+          <w:rtl w:val="0"/>
+        </w:rPr>
+      </w:r>
+    </w:p>
+    <w:p>
+      <w:pPr>
+        <w:spacing w:after="280" w:before="280" w:line="240" w:lineRule="auto"/>
+        <w:ind w:left="0" w:firstLine="0"/>
+        <w:rPr>
+          <w:rFonts w:ascii="Times New Roman" w:cs="Times New Roman" w:eastAsia="Times New Roman" w:hAnsi="Times New Roman"/>
+          <w:sz w:val="28"/>
+          <w:szCs w:val="28"/>
+        </w:rPr>
+      </w:pPr>
+      <w:r>
+        <w:rPr>
+          <w:rFonts w:ascii="Times New Roman" w:cs="Times New Roman" w:eastAsia="Times New Roman" w:hAnsi="Times New Roman"/>
+          <w:sz w:val="28"/>
+          <w:szCs w:val="28"/>
+          <w:rtl w:val="0"/>
+        </w:rPr>
+        <w:t xml:space="preserve">Очікуваний результат: Значення wallet_balance користувача tina збільшиться на 50. </w:t>
+      </w:r>
+    </w:p>
+    <w:p>
+      <w:pPr>
+        <w:spacing w:after="280" w:before="280" w:line="240" w:lineRule="auto"/>
+        <w:ind w:left="0" w:firstLine="0"/>
+        <w:rPr>
+          <w:rFonts w:ascii="Times New Roman" w:cs="Times New Roman" w:eastAsia="Times New Roman" w:hAnsi="Times New Roman"/>
+          <w:b w:val="1"/>
+          <w:bCs w:val="1"/>
+          <w:sz w:val="28"/>
+          <w:szCs w:val="28"/>
+        </w:rPr>
+      </w:pPr>
+      <w:r>
+        <w:rPr>
+          <w:rFonts w:ascii="Times New Roman" w:cs="Times New Roman" w:eastAsia="Times New Roman" w:hAnsi="Times New Roman"/>
+          <w:sz w:val="28"/>
+          <w:szCs w:val="28"/>
+          <w:rtl w:val="0"/>
+        </w:rPr>
+        <w:t xml:space="preserve">Результат: </w:t>
+        <w:br w:type="textWrapping"/>
+      </w:r>
+      <w:r>
+        <w:rPr>
+          <w:rFonts w:ascii="Times New Roman" w:cs="Times New Roman" w:eastAsia="Times New Roman" w:hAnsi="Times New Roman"/>
+          <w:b w:val="1"/>
+          <w:bCs w:val="1"/>
+          <w:sz w:val="28"/>
+          <w:szCs w:val="28"/>
+        </w:rPr>
+        <w:drawing>
+          <wp:inline distB="114300" distT="114300" distL="114300" distR="114300">
+            <wp:extent cx="3924413" cy="1696300"/>
+            <wp:effectExtent b="0" l="0" r="0" t="0"/>
+            <wp:docPr id="25" name="image23.png"/>
+            <a:graphic>
+              <a:graphicData uri="http://schemas.openxmlformats.org/drawingml/2006/picture">
+                <pic:pic>
+                  <pic:nvPicPr>
+                    <pic:cNvPr id="0" name="image23.png"/>
+                    <pic:cNvPicPr preferRelativeResize="0"/>
+                  </pic:nvPicPr>
+                  <pic:blipFill>
+                    <a:blip r:embed="rId27"/>
+                    <a:srcRect b="0" l="0" r="0" t="0"/>
+                    <a:stretch>
+                      <a:fillRect/>
+                    </a:stretch>
+                  </pic:blipFill>
+                  <pic:spPr>
+                    <a:xfrm>
+                      <a:off x="0" y="0"/>
+                      <a:ext cx="3924413" cy="1696300"/>
+                    </a:xfrm>
+                    <a:prstGeom prst="rect"/>
+                    <a:ln/>
+                  </pic:spPr>
+                </pic:pic>
+              </a:graphicData>
+            </a:graphic>
+          </wp:inline>
+        </w:drawing>
+      </w:r>
+      <w:r>
+        <w:rPr>
+          <w:rtl w:val="0"/>
+        </w:rPr>
+      </w:r>
+    </w:p>
+    <w:p>
+      <w:pPr>
+        <w:spacing w:after="280" w:before="280" w:line="240" w:lineRule="auto"/>
+        <w:ind w:left="0" w:firstLine="0"/>
+        <w:rPr>
+          <w:rFonts w:ascii="Times New Roman" w:cs="Times New Roman" w:eastAsia="Times New Roman" w:hAnsi="Times New Roman"/>
+          <w:b w:val="1"/>
+          <w:bCs w:val="1"/>
+          <w:sz w:val="28"/>
+          <w:szCs w:val="28"/>
+        </w:rPr>
+      </w:pPr>
+      <w:r>
+        <w:rPr>
+          <w:rFonts w:ascii="Times New Roman" w:cs="Times New Roman" w:eastAsia="Times New Roman" w:hAnsi="Times New Roman"/>
+          <w:b w:val="1"/>
+          <w:bCs w:val="1"/>
+          <w:sz w:val="28"/>
+          <w:szCs w:val="28"/>
+        </w:rPr>
+        <w:drawing>
+          <wp:inline distB="114300" distT="114300" distL="114300" distR="114300">
+            <wp:extent cx="2857613" cy="2056690"/>
+            <wp:effectExtent b="0" l="0" r="0" t="0"/>
+            <wp:docPr id="2" name="image4.png"/>
+            <a:graphic>
+              <a:graphicData uri="http://schemas.openxmlformats.org/drawingml/2006/picture">
+                <pic:pic>
+                  <pic:nvPicPr>
+                    <pic:cNvPr id="0" name="image4.png"/>
+                    <pic:cNvPicPr preferRelativeResize="0"/>
+                  </pic:nvPicPr>
+                  <pic:blipFill>
+                    <a:blip r:embed="rId28"/>
+                    <a:srcRect b="0" l="0" r="0" t="0"/>
+                    <a:stretch>
+                      <a:fillRect/>
+                    </a:stretch>
+                  </pic:blipFill>
+                  <pic:spPr>
+                    <a:xfrm>
+                      <a:off x="0" y="0"/>
+                      <a:ext cx="2857613" cy="2056690"/>
+                    </a:xfrm>
+                    <a:prstGeom prst="rect"/>
+                    <a:ln/>
+                  </pic:spPr>
+                </pic:pic>
+              </a:graphicData>
+            </a:graphic>
+          </wp:inline>
+        </w:drawing>
+      </w:r>
+      <w:r>
+        <w:rPr>
+          <w:rtl w:val="0"/>
+        </w:rPr>
+      </w:r>
+    </w:p>
+    <w:p>
+      <w:pPr>
+        <w:spacing w:after="280" w:before="280" w:line="240" w:lineRule="auto"/>
+        <w:ind w:left="0" w:firstLine="0"/>
+        <w:rPr>
+          <w:rFonts w:ascii="Times New Roman" w:cs="Times New Roman" w:eastAsia="Times New Roman" w:hAnsi="Times New Roman"/>
+          <w:b w:val="1"/>
+          <w:bCs w:val="1"/>
+          <w:sz w:val="28"/>
+          <w:szCs w:val="28"/>
+        </w:rPr>
+      </w:pPr>
+      <w:r>
+        <w:rPr>
+          <w:rFonts w:ascii="Times New Roman" w:cs="Times New Roman" w:eastAsia="Times New Roman" w:hAnsi="Times New Roman"/>
+          <w:b w:val="1"/>
+          <w:bCs w:val="1"/>
+          <w:sz w:val="28"/>
+          <w:szCs w:val="28"/>
+        </w:rPr>
+        <w:drawing>
+          <wp:inline distB="114300" distT="114300" distL="114300" distR="114300">
+            <wp:extent cx="2905238" cy="1629767"/>
+            <wp:effectExtent b="0" l="0" r="0" t="0"/>
+            <wp:docPr id="12" name="image12.png"/>
+            <a:graphic>
+              <a:graphicData uri="http://schemas.openxmlformats.org/drawingml/2006/picture">
+                <pic:pic>
+                  <pic:nvPicPr>
+                    <pic:cNvPr id="0" name="image12.png"/>
+                    <pic:cNvPicPr preferRelativeResize="0"/>
+                  </pic:nvPicPr>
+                  <pic:blipFill>
+                    <a:blip r:embed="rId29"/>
+                    <a:srcRect b="0" l="0" r="0" t="0"/>
+                    <a:stretch>
+                      <a:fillRect/>
+                    </a:stretch>
+                  </pic:blipFill>
+                  <pic:spPr>
+                    <a:xfrm>
+                      <a:off x="0" y="0"/>
+                      <a:ext cx="2905238" cy="1629767"/>
+                    </a:xfrm>
+                    <a:prstGeom prst="rect"/>
+                    <a:ln/>
+                  </pic:spPr>
+                </pic:pic>
+              </a:graphicData>
+            </a:graphic>
+          </wp:inline>
+        </w:drawing>
+      </w:r>
+      <w:r>
+        <w:rPr>
+          <w:rtl w:val="0"/>
+        </w:rPr>
+      </w:r>
+    </w:p>
+    <w:p>
+      <w:pPr>
+        <w:spacing w:after="280" w:before="280" w:line="240" w:lineRule="auto"/>
+        <w:ind w:left="0" w:firstLine="0"/>
+        <w:rPr>
+          <w:rFonts w:ascii="Times New Roman" w:cs="Times New Roman" w:eastAsia="Times New Roman" w:hAnsi="Times New Roman"/>
+          <w:b w:val="1"/>
+          <w:bCs w:val="1"/>
+          <w:sz w:val="28"/>
+          <w:szCs w:val="28"/>
+        </w:rPr>
+      </w:pPr>
+      <w:r>
+        <w:rPr>
+          <w:rFonts w:ascii="Times New Roman" w:cs="Times New Roman" w:eastAsia="Times New Roman" w:hAnsi="Times New Roman"/>
+          <w:b w:val="1"/>
+          <w:bCs w:val="1"/>
+          <w:sz w:val="28"/>
+          <w:szCs w:val="28"/>
+          <w:rtl w:val="0"/>
+        </w:rPr>
+        <w:t xml:space="preserve">9.  Мета: Видалення зв’язку категорії та продукту </w:t>
+      </w:r>
+    </w:p>
+    <w:p>
+      <w:pPr>
+        <w:spacing w:after="280" w:before="280" w:line="240" w:lineRule="auto"/>
+        <w:rPr>
+          <w:rFonts w:ascii="Times New Roman" w:cs="Times New Roman" w:eastAsia="Times New Roman" w:hAnsi="Times New Roman"/>
+          <w:sz w:val="28"/>
+          <w:szCs w:val="28"/>
+        </w:rPr>
+      </w:pPr>
+      <w:r>
+        <w:rPr>
+          <w:rFonts w:ascii="Times New Roman" w:cs="Times New Roman" w:eastAsia="Times New Roman" w:hAnsi="Times New Roman"/>
+          <w:sz w:val="28"/>
+          <w:szCs w:val="28"/>
+          <w:rtl w:val="0"/>
+        </w:rPr>
+        <w:t xml:space="preserve">Очікуваний результат: Видалення з категорії з id 2 лише продукт з id 3. </w:t>
+      </w:r>
+    </w:p>
+    <w:p>
+      <w:pPr>
+        <w:spacing w:after="280" w:before="280" w:line="240" w:lineRule="auto"/>
+        <w:rPr>
+          <w:rFonts w:ascii="Times New Roman" w:cs="Times New Roman" w:eastAsia="Times New Roman" w:hAnsi="Times New Roman"/>
+          <w:b w:val="1"/>
+          <w:bCs w:val="1"/>
+          <w:sz w:val="28"/>
+          <w:szCs w:val="28"/>
+        </w:rPr>
+      </w:pPr>
+      <w:r>
+        <w:rPr>
+          <w:rFonts w:ascii="Times New Roman" w:cs="Times New Roman" w:eastAsia="Times New Roman" w:hAnsi="Times New Roman"/>
+          <w:sz w:val="28"/>
+          <w:szCs w:val="28"/>
+          <w:rtl w:val="0"/>
+        </w:rPr>
+        <w:t xml:space="preserve">Результат: </w:t>
+      </w:r>
+      <w:r>
+        <w:rPr>
+          <w:rtl w:val="0"/>
+        </w:rPr>
+      </w:r>
+    </w:p>
+    <w:p>
+      <w:pPr>
+        <w:spacing w:after="280" w:before="280" w:line="240" w:lineRule="auto"/>
+        <w:ind w:left="0" w:firstLine="0"/>
+        <w:rPr>
+          <w:rFonts w:ascii="Times New Roman" w:cs="Times New Roman" w:eastAsia="Times New Roman" w:hAnsi="Times New Roman"/>
+          <w:b w:val="1"/>
+          <w:bCs w:val="1"/>
+          <w:sz w:val="28"/>
+          <w:szCs w:val="28"/>
+        </w:rPr>
+      </w:pPr>
+      <w:r>
+        <w:rPr>
+          <w:rFonts w:ascii="Times New Roman" w:cs="Times New Roman" w:eastAsia="Times New Roman" w:hAnsi="Times New Roman"/>
+          <w:b w:val="1"/>
+          <w:bCs w:val="1"/>
+          <w:sz w:val="28"/>
+          <w:szCs w:val="28"/>
+        </w:rPr>
+        <w:drawing>
+          <wp:inline distB="114300" distT="114300" distL="114300" distR="114300">
+            <wp:extent cx="2276588" cy="1832134"/>
+            <wp:effectExtent b="0" l="0" r="0" t="0"/>
+            <wp:docPr id="18" name="image16.png"/>
+            <a:graphic>
+              <a:graphicData uri="http://schemas.openxmlformats.org/drawingml/2006/picture">
+                <pic:pic>
+                  <pic:nvPicPr>
+                    <pic:cNvPr id="0" name="image16.png"/>
+                    <pic:cNvPicPr preferRelativeResize="0"/>
+                  </pic:nvPicPr>
+                  <pic:blipFill>
+                    <a:blip r:embed="rId30"/>
+                    <a:srcRect b="0" l="0" r="0" t="0"/>
+                    <a:stretch>
+                      <a:fillRect/>
+                    </a:stretch>
+                  </pic:blipFill>
+                  <pic:spPr>
+                    <a:xfrm>
+                      <a:off x="0" y="0"/>
+                      <a:ext cx="2276588" cy="1832134"/>
+                    </a:xfrm>
+                    <a:prstGeom prst="rect"/>
+                    <a:ln/>
+                  </pic:spPr>
+                </pic:pic>
+              </a:graphicData>
+            </a:graphic>
+          </wp:inline>
+        </w:drawing>
+      </w:r>
+      <w:r>
+        <w:rPr>
+          <w:rtl w:val="0"/>
+        </w:rPr>
+      </w:r>
+    </w:p>
+    <w:p>
+      <w:pPr>
+        <w:spacing w:after="280" w:before="280" w:line="240" w:lineRule="auto"/>
+        <w:ind w:left="0" w:firstLine="0"/>
+        <w:rPr>
+          <w:rFonts w:ascii="Times New Roman" w:cs="Times New Roman" w:eastAsia="Times New Roman" w:hAnsi="Times New Roman"/>
+          <w:b w:val="1"/>
+          <w:bCs w:val="1"/>
+          <w:sz w:val="28"/>
+          <w:szCs w:val="28"/>
+        </w:rPr>
+      </w:pPr>
+      <w:r>
+        <w:rPr>
+          <w:rFonts w:ascii="Times New Roman" w:cs="Times New Roman" w:eastAsia="Times New Roman" w:hAnsi="Times New Roman"/>
+          <w:b w:val="1"/>
+          <w:bCs w:val="1"/>
+          <w:sz w:val="28"/>
+          <w:szCs w:val="28"/>
+        </w:rPr>
+        <w:drawing>
+          <wp:inline distB="114300" distT="114300" distL="114300" distR="114300">
+            <wp:extent cx="3371963" cy="1364176"/>
+            <wp:effectExtent b="0" l="0" r="0" t="0"/>
+            <wp:docPr id="9" name="image6.png"/>
+            <a:graphic>
+              <a:graphicData uri="http://schemas.openxmlformats.org/drawingml/2006/picture">
+                <pic:pic>
+                  <pic:nvPicPr>
+                    <pic:cNvPr id="0" name="image6.png"/>
+                    <pic:cNvPicPr preferRelativeResize="0"/>
+                  </pic:nvPicPr>
+                  <pic:blipFill>
+                    <a:blip r:embed="rId31"/>
+                    <a:srcRect b="0" l="0" r="0" t="0"/>
+                    <a:stretch>
+                      <a:fillRect/>
+                    </a:stretch>
+                  </pic:blipFill>
+                  <pic:spPr>
+                    <a:xfrm>
+                      <a:off x="0" y="0"/>
+                      <a:ext cx="3371963" cy="1364176"/>
+                    </a:xfrm>
+                    <a:prstGeom prst="rect"/>
+                    <a:ln/>
+                  </pic:spPr>
+                </pic:pic>
+              </a:graphicData>
+            </a:graphic>
+          </wp:inline>
+        </w:drawing>
+      </w:r>
+      <w:r>
+        <w:rPr>
+          <w:rtl w:val="0"/>
+        </w:rPr>
+      </w:r>
+    </w:p>
+    <w:p>
+      <w:pPr>
+        <w:spacing w:after="280" w:before="280" w:line="240" w:lineRule="auto"/>
+        <w:ind w:left="0" w:firstLine="0"/>
+        <w:rPr>
+          <w:rFonts w:ascii="Times New Roman" w:cs="Times New Roman" w:eastAsia="Times New Roman" w:hAnsi="Times New Roman"/>
+          <w:b w:val="1"/>
+          <w:bCs w:val="1"/>
+          <w:sz w:val="28"/>
+          <w:szCs w:val="28"/>
+        </w:rPr>
+      </w:pPr>
+      <w:r>
+        <w:rPr>
+          <w:rFonts w:ascii="Times New Roman" w:cs="Times New Roman" w:eastAsia="Times New Roman" w:hAnsi="Times New Roman"/>
+          <w:b w:val="1"/>
+          <w:bCs w:val="1"/>
+          <w:sz w:val="28"/>
+          <w:szCs w:val="28"/>
+        </w:rPr>
+        <w:drawing>
+          <wp:inline distB="114300" distT="114300" distL="114300" distR="114300">
+            <wp:extent cx="2895713" cy="2246779"/>
+            <wp:effectExtent b="0" l="0" r="0" t="0"/>
+            <wp:docPr id="23" name="image24.png"/>
+            <a:graphic>
+              <a:graphicData uri="http://schemas.openxmlformats.org/drawingml/2006/picture">
+                <pic:pic>
+                  <pic:nvPicPr>
+                    <pic:cNvPr id="0" name="image24.png"/>
+                    <pic:cNvPicPr preferRelativeResize="0"/>
+                  </pic:nvPicPr>
+                  <pic:blipFill>
+                    <a:blip r:embed="rId32"/>
+                    <a:srcRect b="0" l="0" r="0" t="0"/>
+                    <a:stretch>
+                      <a:fillRect/>
+                    </a:stretch>
+                  </pic:blipFill>
+                  <pic:spPr>
+                    <a:xfrm>
+                      <a:off x="0" y="0"/>
+                      <a:ext cx="2895713" cy="2246779"/>
+                    </a:xfrm>
+                    <a:prstGeom prst="rect"/>
+                    <a:ln/>
+                  </pic:spPr>
+                </pic:pic>
+              </a:graphicData>
+            </a:graphic>
+          </wp:inline>
+        </w:drawing>
+      </w:r>
+      <w:r>
+        <w:rPr>
+          <w:rtl w:val="0"/>
+        </w:rPr>
+      </w:r>
+    </w:p>
+    <w:p>
+      <w:pPr>
+        <w:spacing w:after="280" w:before="280" w:line="240" w:lineRule="auto"/>
+        <w:ind w:left="0" w:firstLine="0"/>
+        <w:rPr>
+          <w:rFonts w:ascii="Times New Roman" w:cs="Times New Roman" w:eastAsia="Times New Roman" w:hAnsi="Times New Roman"/>
+          <w:b w:val="1"/>
+          <w:bCs w:val="1"/>
+          <w:sz w:val="28"/>
+          <w:szCs w:val="28"/>
+        </w:rPr>
+      </w:pPr>
+      <w:r>
+        <w:rPr>
+          <w:rFonts w:ascii="Times New Roman" w:cs="Times New Roman" w:eastAsia="Times New Roman" w:hAnsi="Times New Roman"/>
+          <w:b w:val="1"/>
+          <w:bCs w:val="1"/>
+          <w:sz w:val="28"/>
+          <w:szCs w:val="28"/>
+          <w:rtl w:val="0"/>
+        </w:rPr>
+        <w:t xml:space="preserve">10. Мета: Відфільтрувати продукти за діапазоном дат релізу </w:t>
+      </w:r>
+    </w:p>
+    <w:p>
+      <w:pPr>
+        <w:spacing w:after="280" w:before="280" w:line="240" w:lineRule="auto"/>
+        <w:rPr>
+          <w:rFonts w:ascii="Times New Roman" w:cs="Times New Roman" w:eastAsia="Times New Roman" w:hAnsi="Times New Roman"/>
+          <w:sz w:val="28"/>
+          <w:szCs w:val="28"/>
+        </w:rPr>
+      </w:pPr>
+      <w:r>
+        <w:rPr>
+          <w:rFonts w:ascii="Times New Roman" w:cs="Times New Roman" w:eastAsia="Times New Roman" w:hAnsi="Times New Roman"/>
+          <w:sz w:val="28"/>
+          <w:szCs w:val="28"/>
+          <w:rtl w:val="0"/>
+        </w:rPr>
+        <w:t xml:space="preserve">Очікуваний результат: Виводяться продукти, релізнуті з 2015 по 2020 роки. </w:t>
+      </w:r>
+    </w:p>
+    <w:p>
+      <w:pPr>
+        <w:spacing w:after="280" w:before="280" w:line="240" w:lineRule="auto"/>
+        <w:rPr>
+          <w:rFonts w:ascii="Times New Roman" w:cs="Times New Roman" w:eastAsia="Times New Roman" w:hAnsi="Times New Roman"/>
+          <w:b w:val="1"/>
+          <w:bCs w:val="1"/>
+          <w:sz w:val="28"/>
+          <w:szCs w:val="28"/>
+        </w:rPr>
+      </w:pPr>
+      <w:r>
+        <w:rPr>
+          <w:rFonts w:ascii="Times New Roman" w:cs="Times New Roman" w:eastAsia="Times New Roman" w:hAnsi="Times New Roman"/>
+          <w:sz w:val="28"/>
+          <w:szCs w:val="28"/>
+          <w:rtl w:val="0"/>
+        </w:rPr>
+        <w:t xml:space="preserve">Результат: </w:t>
+      </w:r>
+      <w:r>
+        <w:rPr>
+          <w:rtl w:val="0"/>
+        </w:rPr>
+      </w:r>
+    </w:p>
+    <w:p>
+      <w:pPr>
+        <w:spacing w:after="280" w:before="280" w:line="240" w:lineRule="auto"/>
+        <w:ind w:left="0" w:firstLine="0"/>
+        <w:rPr>
+          <w:rFonts w:ascii="Times New Roman" w:cs="Times New Roman" w:eastAsia="Times New Roman" w:hAnsi="Times New Roman"/>
+          <w:b w:val="1"/>
+          <w:bCs w:val="1"/>
+          <w:sz w:val="28"/>
+          <w:szCs w:val="28"/>
+        </w:rPr>
+      </w:pPr>
+      <w:r>
+        <w:rPr>
+          <w:rFonts w:ascii="Times New Roman" w:cs="Times New Roman" w:eastAsia="Times New Roman" w:hAnsi="Times New Roman"/>
+          <w:b w:val="1"/>
+          <w:bCs w:val="1"/>
+          <w:sz w:val="28"/>
+          <w:szCs w:val="28"/>
+        </w:rPr>
+        <w:drawing>
+          <wp:inline distB="114300" distT="114300" distL="114300" distR="114300">
+            <wp:extent cx="5745600" cy="1168400"/>
+            <wp:effectExtent b="0" l="0" r="0" t="0"/>
+            <wp:docPr id="3" name="image3.png"/>
+            <a:graphic>
+              <a:graphicData uri="http://schemas.openxmlformats.org/drawingml/2006/picture">
+                <pic:pic>
+                  <pic:nvPicPr>
+                    <pic:cNvPr id="0" name="image3.png"/>
+                    <pic:cNvPicPr preferRelativeResize="0"/>
+                  </pic:nvPicPr>
+                  <pic:blipFill>
+                    <a:blip r:embed="rId33"/>
+                    <a:srcRect b="0" l="0" r="0" t="0"/>
+                    <a:stretch>
+                      <a:fillRect/>
+                    </a:stretch>
+                  </pic:blipFill>
+                  <pic:spPr>
+                    <a:xfrm>
+                      <a:off x="0" y="0"/>
+                      <a:ext cx="5745600" cy="1168400"/>
+                    </a:xfrm>
+                    <a:prstGeom prst="rect"/>
+                    <a:ln/>
+                  </pic:spPr>
+                </pic:pic>
+              </a:graphicData>
+            </a:graphic>
+          </wp:inline>
+        </w:drawing>
+      </w:r>
+      <w:r>
+        <w:rPr>
+          <w:rtl w:val="0"/>
+        </w:rPr>
       </w:r>
     </w:p>
     <w:p>

</xml_diff>